<commit_message>
DAY-3 Data Types(String,Date)And Create table,Drop tables examples
</commit_message>
<xml_diff>
--- a/DAY-3.docx
+++ b/DAY-3.docx
@@ -3956,6 +3956,442 @@
         <w:t>Query OK, 0 rows affected (0.27 sec)</w:t>
       </w:r>
     </w:p>
+    <w:p/>
+    <w:p>
+      <w:r>
+        <w:t>ASSIGNMENT QUESTION</w:t>
+      </w:r>
+    </w:p>
+    <w:p>
+      <w:r>
+        <w:t>====================</w:t>
+      </w:r>
+    </w:p>
+    <w:p>
+      <w:r>
+        <w:t xml:space="preserve">Create a table named </w:t>
+      </w:r>
+      <w:proofErr w:type="spellStart"/>
+      <w:r>
+        <w:t>company_staff</w:t>
+      </w:r>
+      <w:proofErr w:type="spellEnd"/>
+      <w:r>
+        <w:t>.</w:t>
+      </w:r>
+    </w:p>
+    <w:p>
+      <w:r>
+        <w:t>Add the following columns to the table:</w:t>
+      </w:r>
+    </w:p>
+    <w:p>
+      <w:r>
+        <w:t xml:space="preserve"> </w:t>
+      </w:r>
+      <w:proofErr w:type="spellStart"/>
+      <w:r>
+        <w:t>emp_id</w:t>
+      </w:r>
+      <w:proofErr w:type="spellEnd"/>
+      <w:r>
+        <w:t xml:space="preserve">, age, experience, gender, </w:t>
+      </w:r>
+      <w:proofErr w:type="spellStart"/>
+      <w:r>
+        <w:t>emp_name</w:t>
+      </w:r>
+      <w:proofErr w:type="spellEnd"/>
+      <w:r>
+        <w:t xml:space="preserve">, address, salary, department, skills, </w:t>
+      </w:r>
+      <w:proofErr w:type="spellStart"/>
+      <w:r>
+        <w:t>joining_date</w:t>
+      </w:r>
+      <w:proofErr w:type="spellEnd"/>
+      <w:r>
+        <w:t>.</w:t>
+      </w:r>
+    </w:p>
+    <w:p>
+      <w:r>
+        <w:t>AN</w:t>
+      </w:r>
+      <w:r>
+        <w:t>SWER:</w:t>
+      </w:r>
+    </w:p>
+    <w:p>
+      <w:proofErr w:type="spellStart"/>
+      <w:r>
+        <w:lastRenderedPageBreak/>
+        <w:t>mysql</w:t>
+      </w:r>
+      <w:proofErr w:type="spellEnd"/>
+      <w:r>
+        <w:t>&gt; USE JFS1;</w:t>
+      </w:r>
+    </w:p>
+    <w:p>
+      <w:r>
+        <w:t>Database changed</w:t>
+      </w:r>
+    </w:p>
+    <w:p>
+      <w:proofErr w:type="spellStart"/>
+      <w:r>
+        <w:t>mysql</w:t>
+      </w:r>
+      <w:proofErr w:type="spellEnd"/>
+      <w:r>
+        <w:t>&gt; CREATE TABLE COMPANY_</w:t>
+      </w:r>
+      <w:proofErr w:type="gramStart"/>
+      <w:r>
+        <w:t>STAFF(</w:t>
+      </w:r>
+      <w:proofErr w:type="gramEnd"/>
+    </w:p>
+    <w:p>
+      <w:r>
+        <w:t xml:space="preserve">    -&gt; EMPID INT,</w:t>
+      </w:r>
+    </w:p>
+    <w:p>
+      <w:r>
+        <w:t xml:space="preserve">    -&gt; EMPNAME </w:t>
+      </w:r>
+      <w:proofErr w:type="gramStart"/>
+      <w:r>
+        <w:t>VARCHAR(</w:t>
+      </w:r>
+      <w:proofErr w:type="gramEnd"/>
+      <w:r>
+        <w:t>50),</w:t>
+      </w:r>
+    </w:p>
+    <w:p>
+      <w:r>
+        <w:t xml:space="preserve">    -&gt; AGE INT,</w:t>
+      </w:r>
+    </w:p>
+    <w:p>
+      <w:r>
+        <w:t xml:space="preserve">    -&gt; EXPERIENCE SMALLINT,</w:t>
+      </w:r>
+    </w:p>
+    <w:p>
+      <w:r>
+        <w:t xml:space="preserve">    -&gt; GENDER </w:t>
+      </w:r>
+      <w:proofErr w:type="gramStart"/>
+      <w:r>
+        <w:t>CHAR(</w:t>
+      </w:r>
+      <w:proofErr w:type="gramEnd"/>
+      <w:r>
+        <w:t>1),</w:t>
+      </w:r>
+    </w:p>
+    <w:p>
+      <w:r>
+        <w:t xml:space="preserve">    -&gt; ADDRESS TINYTEXT,</w:t>
+      </w:r>
+    </w:p>
+    <w:p>
+      <w:r>
+        <w:t xml:space="preserve">    -&gt; SALARY </w:t>
+      </w:r>
+      <w:proofErr w:type="gramStart"/>
+      <w:r>
+        <w:t>DECIMAL(</w:t>
+      </w:r>
+      <w:proofErr w:type="gramEnd"/>
+      <w:r>
+        <w:t>10,2),</w:t>
+      </w:r>
+    </w:p>
+    <w:p>
+      <w:r>
+        <w:t xml:space="preserve">    -&gt; DEPARTMENT ENUM('</w:t>
+      </w:r>
+      <w:proofErr w:type="spellStart"/>
+      <w:r>
+        <w:t>HR','IT','Sales','Finance','Support</w:t>
+      </w:r>
+      <w:proofErr w:type="spellEnd"/>
+      <w:r>
+        <w:t>'),</w:t>
+      </w:r>
+    </w:p>
+    <w:p>
+      <w:r>
+        <w:t xml:space="preserve">    -&gt; SKILLS SET('</w:t>
+      </w:r>
+      <w:proofErr w:type="spellStart"/>
+      <w:r>
+        <w:t>Java','Python','SQL','Excel','Communication</w:t>
+      </w:r>
+      <w:proofErr w:type="spellEnd"/>
+      <w:r>
+        <w:t>'),</w:t>
+      </w:r>
+    </w:p>
+    <w:p>
+      <w:r>
+        <w:t xml:space="preserve">    -&gt; DOJ DATE</w:t>
+      </w:r>
+    </w:p>
+    <w:p>
+      <w:r>
+        <w:t xml:space="preserve">    -&gt; );</w:t>
+      </w:r>
+    </w:p>
+    <w:p>
+      <w:r>
+        <w:t>Query OK, 0 rows affected (0.11 sec)</w:t>
+      </w:r>
+    </w:p>
+    <w:p/>
+    <w:p>
+      <w:proofErr w:type="spellStart"/>
+      <w:r>
+        <w:t>mysql</w:t>
+      </w:r>
+      <w:proofErr w:type="spellEnd"/>
+      <w:r>
+        <w:t>&gt; DESC COMPANY_STAFF;</w:t>
+      </w:r>
+    </w:p>
+    <w:p>
+      <w:r>
+        <w:t>+------------+----------------------------------------------------+------+-----+---------+-------+</w:t>
+      </w:r>
+    </w:p>
+    <w:p>
+      <w:r>
+        <w:t>| Field      | Type                                               | Null | Key | Default | Extra |</w:t>
+      </w:r>
+    </w:p>
+    <w:p>
+      <w:r>
+        <w:t>+------------+----------------------------------------------------+------+-----+---------+-------+</w:t>
+      </w:r>
+    </w:p>
+    <w:p>
+      <w:r>
+        <w:t xml:space="preserve">| EMPID      | int                                                | </w:t>
+      </w:r>
+      <w:proofErr w:type="gramStart"/>
+      <w:r>
+        <w:t>YES  |</w:t>
+      </w:r>
+      <w:proofErr w:type="gramEnd"/>
+      <w:r>
+        <w:t xml:space="preserve">     | NULL    |       |</w:t>
+      </w:r>
+    </w:p>
+    <w:p>
+      <w:r>
+        <w:t xml:space="preserve">| EMPNAME    | </w:t>
+      </w:r>
+      <w:proofErr w:type="gramStart"/>
+      <w:r>
+        <w:t>varchar(</w:t>
+      </w:r>
+      <w:proofErr w:type="gramEnd"/>
+      <w:r>
+        <w:t xml:space="preserve">50)                                        | </w:t>
+      </w:r>
+      <w:proofErr w:type="gramStart"/>
+      <w:r>
+        <w:t>YES  |</w:t>
+      </w:r>
+      <w:proofErr w:type="gramEnd"/>
+      <w:r>
+        <w:t xml:space="preserve">     | NULL    |       |</w:t>
+      </w:r>
+    </w:p>
+    <w:p>
+      <w:r>
+        <w:t xml:space="preserve">| AGE        | int                                                | </w:t>
+      </w:r>
+      <w:proofErr w:type="gramStart"/>
+      <w:r>
+        <w:t>YES  |</w:t>
+      </w:r>
+      <w:proofErr w:type="gramEnd"/>
+      <w:r>
+        <w:t xml:space="preserve">     | NULL    |       |</w:t>
+      </w:r>
+    </w:p>
+    <w:p>
+      <w:r>
+        <w:t xml:space="preserve">| EXPERIENCE | </w:t>
+      </w:r>
+      <w:proofErr w:type="spellStart"/>
+      <w:r>
+        <w:t>smallint</w:t>
+      </w:r>
+      <w:proofErr w:type="spellEnd"/>
+      <w:r>
+        <w:t xml:space="preserve">                                           | </w:t>
+      </w:r>
+      <w:proofErr w:type="gramStart"/>
+      <w:r>
+        <w:t>YES  |</w:t>
+      </w:r>
+      <w:proofErr w:type="gramEnd"/>
+      <w:r>
+        <w:t xml:space="preserve">     | NULL    |       |</w:t>
+      </w:r>
+    </w:p>
+    <w:p>
+      <w:r>
+        <w:t xml:space="preserve">| GENDER     | </w:t>
+      </w:r>
+      <w:proofErr w:type="gramStart"/>
+      <w:r>
+        <w:t>char(</w:t>
+      </w:r>
+      <w:proofErr w:type="gramEnd"/>
+      <w:r>
+        <w:t xml:space="preserve">1)                                            | </w:t>
+      </w:r>
+      <w:proofErr w:type="gramStart"/>
+      <w:r>
+        <w:t>YES  |</w:t>
+      </w:r>
+      <w:proofErr w:type="gramEnd"/>
+      <w:r>
+        <w:t xml:space="preserve">     | NULL    |       |</w:t>
+      </w:r>
+    </w:p>
+    <w:p>
+      <w:r>
+        <w:t xml:space="preserve">| ADDRESS    | </w:t>
+      </w:r>
+      <w:proofErr w:type="spellStart"/>
+      <w:r>
+        <w:t>tinytext</w:t>
+      </w:r>
+      <w:proofErr w:type="spellEnd"/>
+      <w:r>
+        <w:t xml:space="preserve">                                           | </w:t>
+      </w:r>
+      <w:proofErr w:type="gramStart"/>
+      <w:r>
+        <w:t>YES  |</w:t>
+      </w:r>
+      <w:proofErr w:type="gramEnd"/>
+      <w:r>
+        <w:t xml:space="preserve">     | NULL    |       |</w:t>
+      </w:r>
+    </w:p>
+    <w:p>
+      <w:r>
+        <w:t xml:space="preserve">| SALARY     | </w:t>
+      </w:r>
+      <w:proofErr w:type="gramStart"/>
+      <w:r>
+        <w:t>decimal(</w:t>
+      </w:r>
+      <w:proofErr w:type="gramEnd"/>
+      <w:r>
+        <w:t xml:space="preserve">10,2)                                      | </w:t>
+      </w:r>
+      <w:proofErr w:type="gramStart"/>
+      <w:r>
+        <w:t>YES  |</w:t>
+      </w:r>
+      <w:proofErr w:type="gramEnd"/>
+      <w:r>
+        <w:t xml:space="preserve">     | NULL    |       |</w:t>
+      </w:r>
+    </w:p>
+    <w:p>
+      <w:r>
+        <w:t xml:space="preserve">| DEPARTMENT | </w:t>
+      </w:r>
+      <w:proofErr w:type="spellStart"/>
+      <w:r>
+        <w:t>enum</w:t>
+      </w:r>
+      <w:proofErr w:type="spellEnd"/>
+      <w:r>
+        <w:t>('</w:t>
+      </w:r>
+      <w:proofErr w:type="spellStart"/>
+      <w:r>
+        <w:t>HR','IT','Sales','Finance','Support</w:t>
+      </w:r>
+      <w:proofErr w:type="spellEnd"/>
+      <w:proofErr w:type="gramStart"/>
+      <w:r>
+        <w:t xml:space="preserve">')   </w:t>
+      </w:r>
+      <w:proofErr w:type="gramEnd"/>
+      <w:r>
+        <w:t xml:space="preserve">     | </w:t>
+      </w:r>
+      <w:proofErr w:type="gramStart"/>
+      <w:r>
+        <w:t>YES  |</w:t>
+      </w:r>
+      <w:proofErr w:type="gramEnd"/>
+      <w:r>
+        <w:t xml:space="preserve">     | NULL    |       |</w:t>
+      </w:r>
+    </w:p>
+    <w:p>
+      <w:r>
+        <w:lastRenderedPageBreak/>
+        <w:t>| SKILLS     | set('</w:t>
+      </w:r>
+      <w:proofErr w:type="spellStart"/>
+      <w:r>
+        <w:t>Java','Python','SQL','Excel','Communication</w:t>
+      </w:r>
+      <w:proofErr w:type="spellEnd"/>
+      <w:r>
+        <w:t xml:space="preserve">') | </w:t>
+      </w:r>
+      <w:proofErr w:type="gramStart"/>
+      <w:r>
+        <w:t>YES  |</w:t>
+      </w:r>
+      <w:proofErr w:type="gramEnd"/>
+      <w:r>
+        <w:t xml:space="preserve">     | NULL    |       |</w:t>
+      </w:r>
+    </w:p>
+    <w:p>
+      <w:r>
+        <w:t xml:space="preserve">| DOJ        | date                                               | </w:t>
+      </w:r>
+      <w:proofErr w:type="gramStart"/>
+      <w:r>
+        <w:t>YES  |</w:t>
+      </w:r>
+      <w:proofErr w:type="gramEnd"/>
+      <w:r>
+        <w:t xml:space="preserve">     | NULL    |       |</w:t>
+      </w:r>
+    </w:p>
+    <w:p>
+      <w:r>
+        <w:t>+------------+----------------------------------------------------+------+-----+---------+-------+</w:t>
+      </w:r>
+    </w:p>
+    <w:p>
+      <w:r>
+        <w:t>10 rows in set (0.01 sec)</w:t>
+      </w:r>
+    </w:p>
+    <w:p/>
+    <w:p/>
+    <w:p/>
     <w:p/>
     <w:sectPr>
       <w:pgSz w:w="11906" w:h="16838"/>
@@ -4570,6 +5006,7 @@
   <w:style w:type="character" w:default="1" w:styleId="DefaultParagraphFont">
     <w:name w:val="Default Paragraph Font"/>
     <w:uiPriority w:val="1"/>
+    <w:semiHidden/>
     <w:unhideWhenUsed/>
   </w:style>
   <w:style w:type="table" w:default="1" w:styleId="TableNormal">

</xml_diff>

<commit_message>
DAY-3 Data Types(String,Date)And Create table,Drop tables examples With ASSIGNMENT
</commit_message>
<xml_diff>
--- a/DAY-3.docx
+++ b/DAY-3.docx
@@ -3986,9 +3986,6 @@
       </w:r>
     </w:p>
     <w:p>
-      <w:r>
-        <w:t xml:space="preserve"> </w:t>
-      </w:r>
       <w:proofErr w:type="spellStart"/>
       <w:r>
         <w:t>emp_id</w:t>
@@ -4019,7 +4016,7 @@
         <w:t>AN</w:t>
       </w:r>
       <w:r>
-        <w:t>SWER:</w:t>
+        <w:t>SWER</w:t>
       </w:r>
     </w:p>
     <w:p>

</xml_diff>